<commit_message>
feature: Added pageobjects and modified interview prep documents
</commit_message>
<xml_diff>
--- a/interview-prep/pw-01-use_of_tsconfig_file.docx
+++ b/interview-prep/pw-01-use_of_tsconfig_file.docx
@@ -54,7 +54,15 @@
     </w:p>
     <w:p>
       <w:r>
-        <w:t>Imagine you're writing your tests in a language called TypeScript. But computers don't understand TypeScript directly — they only understand JavaScript. So TypeScript needs to be translated into JavaScript before it can run.</w:t>
+        <w:t xml:space="preserve">Imagine you're writing your tests in a language called TypeScript. But computers don't understand TypeScript directly — they only understand JavaScript. </w:t>
+      </w:r>
+      <w:proofErr w:type="gramStart"/>
+      <w:r>
+        <w:t>So</w:t>
+      </w:r>
+      <w:proofErr w:type="gramEnd"/>
+      <w:r>
+        <w:t xml:space="preserve"> TypeScript needs to be translated into JavaScript before it can run.</w:t>
       </w:r>
     </w:p>
     <w:p>
@@ -125,10 +133,12 @@
         <w:t xml:space="preserve">Similarly, </w:t>
       </w:r>
       <w:proofErr w:type="spellStart"/>
+      <w:proofErr w:type="gramStart"/>
       <w:r>
         <w:t>tsconfig.json</w:t>
       </w:r>
       <w:proofErr w:type="spellEnd"/>
+      <w:proofErr w:type="gramEnd"/>
       <w:r>
         <w:t xml:space="preserve"> lets you set:</w:t>
       </w:r>
@@ -249,6 +259,7 @@
         <w:t xml:space="preserve">automatically creates the </w:t>
       </w:r>
       <w:proofErr w:type="spellStart"/>
+      <w:proofErr w:type="gramStart"/>
       <w:r>
         <w:rPr>
           <w:b/>
@@ -257,6 +268,7 @@
         <w:t>tsconfig.json</w:t>
       </w:r>
       <w:proofErr w:type="spellEnd"/>
+      <w:proofErr w:type="gramEnd"/>
       <w:r>
         <w:t xml:space="preserve"> for you with all the right settings. You don't need to touch it at all when starting out.</w:t>
       </w:r>
@@ -298,13 +310,27 @@
         </w:rPr>
         <w:t xml:space="preserve"> file is not created while creating the project. Please follow below </w:t>
       </w:r>
+      <w:r>
+        <w:rPr>
+          <w:b/>
+          <w:bCs/>
+        </w:rPr>
+        <w:t>options</w:t>
+      </w:r>
+      <w:r>
+        <w:rPr>
+          <w:b/>
+          <w:bCs/>
+        </w:rPr>
+        <w:t xml:space="preserve"> to create the </w:t>
+      </w:r>
       <w:proofErr w:type="spellStart"/>
       <w:r>
         <w:rPr>
           <w:b/>
           <w:bCs/>
         </w:rPr>
-        <w:t>opions</w:t>
+        <w:t>tsconfig.json</w:t>
       </w:r>
       <w:proofErr w:type="spellEnd"/>
       <w:r>
@@ -312,81 +338,98 @@
           <w:b/>
           <w:bCs/>
         </w:rPr>
-        <w:t xml:space="preserve"> to create the </w:t>
+        <w:t xml:space="preserve"> file</w:t>
+      </w:r>
+    </w:p>
+    <w:p>
+      <w:pPr>
+        <w:rPr>
+          <w:b/>
+          <w:bCs/>
+        </w:rPr>
+      </w:pPr>
+      <w:r>
+        <w:rPr>
+          <w:b/>
+          <w:bCs/>
+        </w:rPr>
+        <w:t>Option 1: Create it manually (Easiest)</w:t>
+      </w:r>
+    </w:p>
+    <w:p>
+      <w:r>
+        <w:t xml:space="preserve">Just create a new file named </w:t>
       </w:r>
       <w:proofErr w:type="spellStart"/>
-      <w:r>
-        <w:rPr>
-          <w:b/>
-          <w:bCs/>
-        </w:rPr>
+      <w:proofErr w:type="gramStart"/>
+      <w:r>
         <w:t>tsconfig.json</w:t>
       </w:r>
       <w:proofErr w:type="spellEnd"/>
-      <w:r>
-        <w:rPr>
-          <w:b/>
-          <w:bCs/>
-        </w:rPr>
-        <w:t xml:space="preserve"> file</w:t>
-      </w:r>
-    </w:p>
-    <w:p>
-      <w:pPr>
-        <w:rPr>
-          <w:b/>
-          <w:bCs/>
-        </w:rPr>
-      </w:pPr>
-      <w:r>
-        <w:rPr>
-          <w:b/>
-          <w:bCs/>
-        </w:rPr>
-        <w:t>Option 1: Create it manually (Easiest)</w:t>
-      </w:r>
-    </w:p>
-    <w:p>
-      <w:r>
-        <w:t xml:space="preserve">Just create a new file named </w:t>
+      <w:proofErr w:type="gramEnd"/>
+      <w:r>
+        <w:t xml:space="preserve"> in your root project folder (the main folder of your project) and paste this inside it:</w:t>
+      </w:r>
+    </w:p>
+    <w:p>
+      <w:pPr>
+        <w:rPr>
+          <w:b/>
+          <w:bCs/>
+        </w:rPr>
+      </w:pPr>
+      <w:r>
+        <w:rPr>
+          <w:b/>
+          <w:bCs/>
+        </w:rPr>
+        <w:t>{</w:t>
+      </w:r>
+    </w:p>
+    <w:p>
+      <w:pPr>
+        <w:rPr>
+          <w:b/>
+          <w:bCs/>
+        </w:rPr>
+      </w:pPr>
+      <w:r>
+        <w:rPr>
+          <w:b/>
+          <w:bCs/>
+        </w:rPr>
+        <w:t xml:space="preserve">  "</w:t>
       </w:r>
       <w:proofErr w:type="spellStart"/>
       <w:r>
-        <w:t>tsconfig.json</w:t>
+        <w:rPr>
+          <w:b/>
+          <w:bCs/>
+        </w:rPr>
+        <w:t>compilerOptions</w:t>
       </w:r>
       <w:proofErr w:type="spellEnd"/>
       <w:r>
-        <w:t xml:space="preserve"> in your root project folder (the main folder of your project) and paste this inside it:</w:t>
-      </w:r>
-    </w:p>
-    <w:p>
-      <w:pPr>
-        <w:rPr>
-          <w:b/>
-          <w:bCs/>
-        </w:rPr>
-      </w:pPr>
-      <w:r>
-        <w:rPr>
-          <w:b/>
-          <w:bCs/>
-        </w:rPr>
-        <w:t>{</w:t>
-      </w:r>
-    </w:p>
-    <w:p>
-      <w:pPr>
-        <w:rPr>
-          <w:b/>
-          <w:bCs/>
-        </w:rPr>
-      </w:pPr>
-      <w:r>
-        <w:rPr>
-          <w:b/>
-          <w:bCs/>
-        </w:rPr>
-        <w:t xml:space="preserve">  "</w:t>
+        <w:rPr>
+          <w:b/>
+          <w:bCs/>
+        </w:rPr>
+        <w:t>": {</w:t>
+      </w:r>
+    </w:p>
+    <w:p>
+      <w:pPr>
+        <w:rPr>
+          <w:b/>
+          <w:bCs/>
+        </w:rPr>
+      </w:pPr>
+      <w:r>
+        <w:rPr>
+          <w:b/>
+          <w:bCs/>
+        </w:rPr>
+        <w:t xml:space="preserve">    "target": "</w:t>
       </w:r>
       <w:proofErr w:type="spellStart"/>
       <w:r>
@@ -394,7 +437,7 @@
           <w:b/>
           <w:bCs/>
         </w:rPr>
-        <w:t>compilerOptions</w:t>
+        <w:t>ESNext</w:t>
       </w:r>
       <w:proofErr w:type="spellEnd"/>
       <w:r>
@@ -402,22 +445,22 @@
           <w:b/>
           <w:bCs/>
         </w:rPr>
-        <w:t>": {</w:t>
-      </w:r>
-    </w:p>
-    <w:p>
-      <w:pPr>
-        <w:rPr>
-          <w:b/>
-          <w:bCs/>
-        </w:rPr>
-      </w:pPr>
-      <w:r>
-        <w:rPr>
-          <w:b/>
-          <w:bCs/>
-        </w:rPr>
-        <w:t xml:space="preserve">    "target": "</w:t>
+        <w:t>",</w:t>
+      </w:r>
+    </w:p>
+    <w:p>
+      <w:pPr>
+        <w:rPr>
+          <w:b/>
+          <w:bCs/>
+        </w:rPr>
+      </w:pPr>
+      <w:r>
+        <w:rPr>
+          <w:b/>
+          <w:bCs/>
+        </w:rPr>
+        <w:t xml:space="preserve">    "module": "</w:t>
       </w:r>
       <w:proofErr w:type="spellStart"/>
       <w:r>
@@ -425,7 +468,7 @@
           <w:b/>
           <w:bCs/>
         </w:rPr>
-        <w:t>ESNext</w:t>
+        <w:t>CommonJS</w:t>
       </w:r>
       <w:proofErr w:type="spellEnd"/>
       <w:r>
@@ -448,7 +491,7 @@
           <w:b/>
           <w:bCs/>
         </w:rPr>
-        <w:t xml:space="preserve">    "module": "</w:t>
+        <w:t xml:space="preserve">    "</w:t>
       </w:r>
       <w:proofErr w:type="spellStart"/>
       <w:r>
@@ -456,7 +499,7 @@
           <w:b/>
           <w:bCs/>
         </w:rPr>
-        <w:t>CommonJS</w:t>
+        <w:t>moduleResolution</w:t>
       </w:r>
       <w:proofErr w:type="spellEnd"/>
       <w:r>
@@ -464,6 +507,144 @@
           <w:b/>
           <w:bCs/>
         </w:rPr>
+        <w:t>": "node",</w:t>
+      </w:r>
+    </w:p>
+    <w:p>
+      <w:pPr>
+        <w:rPr>
+          <w:b/>
+          <w:bCs/>
+        </w:rPr>
+      </w:pPr>
+      <w:r>
+        <w:rPr>
+          <w:b/>
+          <w:bCs/>
+        </w:rPr>
+        <w:t xml:space="preserve">    "strict": true,</w:t>
+      </w:r>
+    </w:p>
+    <w:p>
+      <w:pPr>
+        <w:rPr>
+          <w:b/>
+          <w:bCs/>
+        </w:rPr>
+      </w:pPr>
+      <w:r>
+        <w:rPr>
+          <w:b/>
+          <w:bCs/>
+        </w:rPr>
+        <w:t xml:space="preserve">    "</w:t>
+      </w:r>
+      <w:proofErr w:type="spellStart"/>
+      <w:r>
+        <w:rPr>
+          <w:b/>
+          <w:bCs/>
+        </w:rPr>
+        <w:t>esModuleInterop</w:t>
+      </w:r>
+      <w:proofErr w:type="spellEnd"/>
+      <w:r>
+        <w:rPr>
+          <w:b/>
+          <w:bCs/>
+        </w:rPr>
+        <w:t>": true,</w:t>
+      </w:r>
+    </w:p>
+    <w:p>
+      <w:pPr>
+        <w:rPr>
+          <w:b/>
+          <w:bCs/>
+        </w:rPr>
+      </w:pPr>
+      <w:r>
+        <w:rPr>
+          <w:b/>
+          <w:bCs/>
+        </w:rPr>
+        <w:t xml:space="preserve">    "</w:t>
+      </w:r>
+      <w:proofErr w:type="spellStart"/>
+      <w:r>
+        <w:rPr>
+          <w:b/>
+          <w:bCs/>
+        </w:rPr>
+        <w:t>sourceMap</w:t>
+      </w:r>
+      <w:proofErr w:type="spellEnd"/>
+      <w:r>
+        <w:rPr>
+          <w:b/>
+          <w:bCs/>
+        </w:rPr>
+        <w:t>": true</w:t>
+      </w:r>
+    </w:p>
+    <w:p>
+      <w:pPr>
+        <w:rPr>
+          <w:b/>
+          <w:bCs/>
+        </w:rPr>
+      </w:pPr>
+      <w:r>
+        <w:rPr>
+          <w:b/>
+          <w:bCs/>
+        </w:rPr>
+        <w:t xml:space="preserve">  },</w:t>
+      </w:r>
+    </w:p>
+    <w:p>
+      <w:pPr>
+        <w:rPr>
+          <w:b/>
+          <w:bCs/>
+        </w:rPr>
+      </w:pPr>
+      <w:r>
+        <w:rPr>
+          <w:b/>
+          <w:bCs/>
+        </w:rPr>
+        <w:t xml:space="preserve">  "include": [</w:t>
+      </w:r>
+    </w:p>
+    <w:p>
+      <w:pPr>
+        <w:rPr>
+          <w:b/>
+          <w:bCs/>
+        </w:rPr>
+      </w:pPr>
+      <w:r>
+        <w:rPr>
+          <w:b/>
+          <w:bCs/>
+        </w:rPr>
+        <w:t xml:space="preserve">    "tests/**/*.</w:t>
+      </w:r>
+      <w:proofErr w:type="spellStart"/>
+      <w:r>
+        <w:rPr>
+          <w:b/>
+          <w:bCs/>
+        </w:rPr>
+        <w:t>ts</w:t>
+      </w:r>
+      <w:proofErr w:type="spellEnd"/>
+      <w:r>
+        <w:rPr>
+          <w:b/>
+          <w:bCs/>
+        </w:rPr>
         <w:t>",</w:t>
       </w:r>
     </w:p>
@@ -482,181 +663,21 @@
         <w:t xml:space="preserve">    "</w:t>
       </w:r>
       <w:proofErr w:type="spellStart"/>
-      <w:r>
-        <w:rPr>
-          <w:b/>
-          <w:bCs/>
-        </w:rPr>
-        <w:t>moduleResolution</w:t>
-      </w:r>
-      <w:proofErr w:type="spellEnd"/>
-      <w:r>
-        <w:rPr>
-          <w:b/>
-          <w:bCs/>
-        </w:rPr>
-        <w:t>": "node",</w:t>
-      </w:r>
-    </w:p>
-    <w:p>
-      <w:pPr>
-        <w:rPr>
-          <w:b/>
-          <w:bCs/>
-        </w:rPr>
-      </w:pPr>
-      <w:r>
-        <w:rPr>
-          <w:b/>
-          <w:bCs/>
-        </w:rPr>
-        <w:t xml:space="preserve">    "strict": true,</w:t>
-      </w:r>
-    </w:p>
-    <w:p>
-      <w:pPr>
-        <w:rPr>
-          <w:b/>
-          <w:bCs/>
-        </w:rPr>
-      </w:pPr>
-      <w:r>
-        <w:rPr>
-          <w:b/>
-          <w:bCs/>
-        </w:rPr>
-        <w:t xml:space="preserve">    "</w:t>
-      </w:r>
-      <w:proofErr w:type="spellStart"/>
-      <w:r>
-        <w:rPr>
-          <w:b/>
-          <w:bCs/>
-        </w:rPr>
-        <w:t>esModuleInterop</w:t>
-      </w:r>
-      <w:proofErr w:type="spellEnd"/>
-      <w:r>
-        <w:rPr>
-          <w:b/>
-          <w:bCs/>
-        </w:rPr>
-        <w:t>": true,</w:t>
-      </w:r>
-    </w:p>
-    <w:p>
-      <w:pPr>
-        <w:rPr>
-          <w:b/>
-          <w:bCs/>
-        </w:rPr>
-      </w:pPr>
-      <w:r>
-        <w:rPr>
-          <w:b/>
-          <w:bCs/>
-        </w:rPr>
-        <w:t xml:space="preserve">    "</w:t>
-      </w:r>
-      <w:proofErr w:type="spellStart"/>
-      <w:r>
-        <w:rPr>
-          <w:b/>
-          <w:bCs/>
-        </w:rPr>
-        <w:t>sourceMap</w:t>
-      </w:r>
-      <w:proofErr w:type="spellEnd"/>
-      <w:r>
-        <w:rPr>
-          <w:b/>
-          <w:bCs/>
-        </w:rPr>
-        <w:t>": true</w:t>
-      </w:r>
-    </w:p>
-    <w:p>
-      <w:pPr>
-        <w:rPr>
-          <w:b/>
-          <w:bCs/>
-        </w:rPr>
-      </w:pPr>
-      <w:r>
-        <w:rPr>
-          <w:b/>
-          <w:bCs/>
-        </w:rPr>
-        <w:t xml:space="preserve">  },</w:t>
-      </w:r>
-    </w:p>
-    <w:p>
-      <w:pPr>
-        <w:rPr>
-          <w:b/>
-          <w:bCs/>
-        </w:rPr>
-      </w:pPr>
-      <w:r>
-        <w:rPr>
-          <w:b/>
-          <w:bCs/>
-        </w:rPr>
-        <w:t xml:space="preserve">  "include": [</w:t>
-      </w:r>
-    </w:p>
-    <w:p>
-      <w:pPr>
-        <w:rPr>
-          <w:b/>
-          <w:bCs/>
-        </w:rPr>
-      </w:pPr>
-      <w:r>
-        <w:rPr>
-          <w:b/>
-          <w:bCs/>
-        </w:rPr>
-        <w:t xml:space="preserve">    "tests/**/*.</w:t>
-      </w:r>
-      <w:proofErr w:type="spellStart"/>
-      <w:r>
-        <w:rPr>
-          <w:b/>
-          <w:bCs/>
-        </w:rPr>
-        <w:t>ts</w:t>
-      </w:r>
-      <w:proofErr w:type="spellEnd"/>
-      <w:r>
-        <w:rPr>
-          <w:b/>
-          <w:bCs/>
-        </w:rPr>
-        <w:t>",</w:t>
-      </w:r>
-    </w:p>
-    <w:p>
-      <w:pPr>
-        <w:rPr>
-          <w:b/>
-          <w:bCs/>
-        </w:rPr>
-      </w:pPr>
-      <w:r>
-        <w:rPr>
-          <w:b/>
-          <w:bCs/>
-        </w:rPr>
-        <w:t xml:space="preserve">    "</w:t>
-      </w:r>
-      <w:proofErr w:type="spellStart"/>
-      <w:r>
-        <w:rPr>
-          <w:b/>
-          <w:bCs/>
-        </w:rPr>
-        <w:t>playwright.config.ts</w:t>
+      <w:proofErr w:type="gramStart"/>
+      <w:r>
+        <w:rPr>
+          <w:b/>
+          <w:bCs/>
+        </w:rPr>
+        <w:t>playwright</w:t>
+      </w:r>
+      <w:proofErr w:type="gramEnd"/>
+      <w:r>
+        <w:rPr>
+          <w:b/>
+          <w:bCs/>
+        </w:rPr>
+        <w:t>.config.ts</w:t>
       </w:r>
       <w:proofErr w:type="spellEnd"/>
       <w:r>
@@ -1010,8 +1031,13 @@
               <w:t>outDir</w:t>
             </w:r>
             <w:proofErr w:type="spellEnd"/>
+            <w:proofErr w:type="gramStart"/>
             <w:r>
-              <w:t>: ./</w:t>
+              <w:t>: .</w:t>
+            </w:r>
+            <w:proofErr w:type="gramEnd"/>
+            <w:r>
+              <w:t>/</w:t>
             </w:r>
             <w:proofErr w:type="spellStart"/>
             <w:r>
@@ -1151,10 +1177,12 @@
         <w:t>This will automatically generate a `</w:t>
       </w:r>
       <w:proofErr w:type="spellStart"/>
+      <w:proofErr w:type="gramStart"/>
       <w:r>
         <w:t>tsconfig.json</w:t>
       </w:r>
       <w:proofErr w:type="spellEnd"/>
+      <w:proofErr w:type="gramEnd"/>
       <w:r>
         <w:t>` file with all the common settings.</w:t>
       </w:r>
@@ -1206,8 +1234,13 @@
         <w:t xml:space="preserve">│   └── </w:t>
       </w:r>
       <w:proofErr w:type="spellStart"/>
-      <w:r>
-        <w:t>example.spec.ts</w:t>
+      <w:proofErr w:type="gramStart"/>
+      <w:r>
+        <w:t>example.spec</w:t>
+      </w:r>
+      <w:proofErr w:type="gramEnd"/>
+      <w:r>
+        <w:t>.ts</w:t>
       </w:r>
       <w:proofErr w:type="spellEnd"/>
     </w:p>
@@ -1250,20 +1283,24 @@
         <w:t xml:space="preserve"> </w:t>
       </w:r>
       <w:proofErr w:type="spellStart"/>
+      <w:proofErr w:type="gramStart"/>
       <w:r>
         <w:t>package.json</w:t>
       </w:r>
       <w:proofErr w:type="spellEnd"/>
+      <w:proofErr w:type="gramEnd"/>
     </w:p>
     <w:p>
       <w:r>
         <w:t xml:space="preserve">└── </w:t>
       </w:r>
       <w:proofErr w:type="spellStart"/>
+      <w:proofErr w:type="gramStart"/>
       <w:r>
         <w:t>tsconfig.json</w:t>
       </w:r>
       <w:proofErr w:type="spellEnd"/>
+      <w:proofErr w:type="gramEnd"/>
       <w:r>
         <w:t xml:space="preserve">   </w:t>
       </w:r>
@@ -3415,6 +3452,7 @@
   <w:style w:type="character" w:default="1" w:styleId="DefaultParagraphFont">
     <w:name w:val="Default Paragraph Font"/>
     <w:uiPriority w:val="1"/>
+    <w:semiHidden/>
     <w:unhideWhenUsed/>
   </w:style>
   <w:style w:type="table" w:default="1" w:styleId="TableNormal">

</xml_diff>